<commit_message>
feat: Add LeverancierProduct management functionality
- Created LeverancierProductController for handling product overview, details, and deletion.
- Implemented LeverancierProduct model with methods for retrieving and deleting products.
- Added stored procedures for fetching product overview and details, as well as for deleting products.
- Updated database schema to include necessary tables and relationships.
- Created views for displaying product overview and details with pagination and deletion options.
- Updated navigation to include link to LeverancierProduct overview.
- Added unit tests for product retrieval and deletion functionality.
</commit_message>
<xml_diff>
--- a/Sjabloon/SpecificatieContactjamin.docx
+++ b/Sjabloon/SpecificatieContactjamin.docx
@@ -4802,10 +4802,7 @@
           </w:tcPr>
           <w:p>
             <w:r>
-              <w:t>FOREIGN</w:t>
-            </w:r>
-            <w:r>
-              <w:t xml:space="preserve"> KEY</w:t>
+              <w:t>FOREIGN KEY</w:t>
             </w:r>
           </w:p>
         </w:tc>
@@ -5924,10 +5921,7 @@
           </w:tcPr>
           <w:p>
             <w:r>
-              <w:t xml:space="preserve">FOREIGN </w:t>
-            </w:r>
-            <w:r>
-              <w:t xml:space="preserve"> KEY</w:t>
+              <w:t>FOREIGN  KEY</w:t>
             </w:r>
           </w:p>
         </w:tc>
@@ -6050,10 +6044,7 @@
           </w:tcPr>
           <w:p>
             <w:r>
-              <w:t>FOREIGN</w:t>
-            </w:r>
-            <w:r>
-              <w:t xml:space="preserve"> KEY</w:t>
+              <w:t>FOREIGN KEY</w:t>
             </w:r>
           </w:p>
         </w:tc>
@@ -7856,6 +7847,1003 @@
         <w:tc>
           <w:tcPr>
             <w:tcW w:w="2254" w:type="dxa"/>
+            <w:tcBorders>
+              <w:top w:val="single" w:sz="4" w:space="0" w:color="000000"/>
+              <w:left w:val="single" w:sz="4" w:space="0" w:color="000000"/>
+              <w:bottom w:val="single" w:sz="4" w:space="0" w:color="000000"/>
+              <w:right w:val="single" w:sz="4" w:space="0" w:color="000000"/>
+            </w:tcBorders>
+            <w:tcMar>
+              <w:top w:w="0" w:type="dxa"/>
+              <w:left w:w="108" w:type="dxa"/>
+              <w:bottom w:w="0" w:type="dxa"/>
+              <w:right w:w="108" w:type="dxa"/>
+            </w:tcMar>
+            <w:hideMark/>
+          </w:tcPr>
+          <w:p>
+            <w:r>
+              <w:t>DEFAULT NOW(6)</w:t>
+            </w:r>
+          </w:p>
+        </w:tc>
+      </w:tr>
+    </w:tbl>
+    <w:p/>
+    <w:tbl>
+      <w:tblPr>
+        <w:tblW w:w="9062" w:type="dxa"/>
+        <w:tblCellMar>
+          <w:left w:w="10" w:type="dxa"/>
+          <w:right w:w="10" w:type="dxa"/>
+        </w:tblCellMar>
+        <w:tblLook w:val="04A0" w:firstRow="1" w:lastRow="0" w:firstColumn="1" w:lastColumn="0" w:noHBand="0" w:noVBand="1"/>
+      </w:tblPr>
+      <w:tblGrid>
+        <w:gridCol w:w="3024"/>
+        <w:gridCol w:w="1527"/>
+        <w:gridCol w:w="1136"/>
+        <w:gridCol w:w="1247"/>
+        <w:gridCol w:w="2128"/>
+      </w:tblGrid>
+      <w:tr>
+        <w:tc>
+          <w:tcPr>
+            <w:tcW w:w="9062" w:type="dxa"/>
+            <w:gridSpan w:val="5"/>
+            <w:tcBorders>
+              <w:top w:val="single" w:sz="4" w:space="0" w:color="000000"/>
+              <w:left w:val="single" w:sz="4" w:space="0" w:color="000000"/>
+              <w:bottom w:val="single" w:sz="4" w:space="0" w:color="000000"/>
+              <w:right w:val="single" w:sz="4" w:space="0" w:color="000000"/>
+            </w:tcBorders>
+            <w:tcMar>
+              <w:top w:w="0" w:type="dxa"/>
+              <w:left w:w="108" w:type="dxa"/>
+              <w:bottom w:w="0" w:type="dxa"/>
+              <w:right w:w="108" w:type="dxa"/>
+            </w:tcMar>
+            <w:hideMark/>
+          </w:tcPr>
+          <w:p>
+            <w:pPr>
+              <w:rPr>
+                <w:b/>
+                <w:bCs/>
+                <w:lang w:val="en-NL"/>
+              </w:rPr>
+            </w:pPr>
+            <w:proofErr w:type="spellStart"/>
+            <w:r>
+              <w:rPr>
+                <w:b/>
+                <w:bCs/>
+                <w:lang w:val="en-NL"/>
+              </w:rPr>
+              <w:t>ProductEinddatumLevering</w:t>
+            </w:r>
+            <w:proofErr w:type="spellEnd"/>
+          </w:p>
+        </w:tc>
+      </w:tr>
+      <w:tr>
+        <w:tc>
+          <w:tcPr>
+            <w:tcW w:w="3024" w:type="dxa"/>
+            <w:tcBorders>
+              <w:top w:val="single" w:sz="4" w:space="0" w:color="000000"/>
+              <w:left w:val="single" w:sz="4" w:space="0" w:color="000000"/>
+              <w:bottom w:val="single" w:sz="4" w:space="0" w:color="000000"/>
+              <w:right w:val="single" w:sz="4" w:space="0" w:color="000000"/>
+            </w:tcBorders>
+            <w:tcMar>
+              <w:top w:w="0" w:type="dxa"/>
+              <w:left w:w="108" w:type="dxa"/>
+              <w:bottom w:w="0" w:type="dxa"/>
+              <w:right w:w="108" w:type="dxa"/>
+            </w:tcMar>
+            <w:hideMark/>
+          </w:tcPr>
+          <w:p>
+            <w:r>
+              <w:t>Kolomnaam</w:t>
+            </w:r>
+          </w:p>
+        </w:tc>
+        <w:tc>
+          <w:tcPr>
+            <w:tcW w:w="1527" w:type="dxa"/>
+            <w:tcBorders>
+              <w:top w:val="single" w:sz="4" w:space="0" w:color="000000"/>
+              <w:left w:val="single" w:sz="4" w:space="0" w:color="000000"/>
+              <w:bottom w:val="single" w:sz="4" w:space="0" w:color="000000"/>
+              <w:right w:val="single" w:sz="4" w:space="0" w:color="000000"/>
+            </w:tcBorders>
+            <w:tcMar>
+              <w:top w:w="0" w:type="dxa"/>
+              <w:left w:w="108" w:type="dxa"/>
+              <w:bottom w:w="0" w:type="dxa"/>
+              <w:right w:w="108" w:type="dxa"/>
+            </w:tcMar>
+            <w:hideMark/>
+          </w:tcPr>
+          <w:p>
+            <w:r>
+              <w:t>Datatype</w:t>
+            </w:r>
+          </w:p>
+        </w:tc>
+        <w:tc>
+          <w:tcPr>
+            <w:tcW w:w="1136" w:type="dxa"/>
+            <w:tcBorders>
+              <w:top w:val="single" w:sz="4" w:space="0" w:color="000000"/>
+              <w:left w:val="single" w:sz="4" w:space="0" w:color="000000"/>
+              <w:bottom w:val="single" w:sz="4" w:space="0" w:color="000000"/>
+              <w:right w:val="single" w:sz="4" w:space="0" w:color="000000"/>
+            </w:tcBorders>
+            <w:tcMar>
+              <w:top w:w="0" w:type="dxa"/>
+              <w:left w:w="108" w:type="dxa"/>
+              <w:bottom w:w="0" w:type="dxa"/>
+              <w:right w:w="108" w:type="dxa"/>
+            </w:tcMar>
+            <w:hideMark/>
+          </w:tcPr>
+          <w:p>
+            <w:r>
+              <w:t>Lengte</w:t>
+            </w:r>
+          </w:p>
+        </w:tc>
+        <w:tc>
+          <w:tcPr>
+            <w:tcW w:w="1247" w:type="dxa"/>
+            <w:tcBorders>
+              <w:top w:val="single" w:sz="4" w:space="0" w:color="000000"/>
+              <w:left w:val="single" w:sz="4" w:space="0" w:color="000000"/>
+              <w:bottom w:val="single" w:sz="4" w:space="0" w:color="000000"/>
+              <w:right w:val="single" w:sz="4" w:space="0" w:color="000000"/>
+            </w:tcBorders>
+            <w:tcMar>
+              <w:top w:w="0" w:type="dxa"/>
+              <w:left w:w="108" w:type="dxa"/>
+              <w:bottom w:w="0" w:type="dxa"/>
+              <w:right w:w="108" w:type="dxa"/>
+            </w:tcMar>
+            <w:hideMark/>
+          </w:tcPr>
+          <w:p>
+            <w:proofErr w:type="spellStart"/>
+            <w:r>
+              <w:t>Nullable</w:t>
+            </w:r>
+            <w:proofErr w:type="spellEnd"/>
+          </w:p>
+        </w:tc>
+        <w:tc>
+          <w:tcPr>
+            <w:tcW w:w="2128" w:type="dxa"/>
+            <w:tcBorders>
+              <w:top w:val="single" w:sz="4" w:space="0" w:color="000000"/>
+              <w:left w:val="single" w:sz="4" w:space="0" w:color="000000"/>
+              <w:bottom w:val="single" w:sz="4" w:space="0" w:color="000000"/>
+              <w:right w:val="single" w:sz="4" w:space="0" w:color="000000"/>
+            </w:tcBorders>
+            <w:tcMar>
+              <w:top w:w="0" w:type="dxa"/>
+              <w:left w:w="108" w:type="dxa"/>
+              <w:bottom w:w="0" w:type="dxa"/>
+              <w:right w:w="108" w:type="dxa"/>
+            </w:tcMar>
+            <w:hideMark/>
+          </w:tcPr>
+          <w:p>
+            <w:r>
+              <w:t>Opmerking</w:t>
+            </w:r>
+          </w:p>
+        </w:tc>
+      </w:tr>
+      <w:tr>
+        <w:tc>
+          <w:tcPr>
+            <w:tcW w:w="3024" w:type="dxa"/>
+            <w:tcBorders>
+              <w:top w:val="single" w:sz="4" w:space="0" w:color="000000"/>
+              <w:left w:val="single" w:sz="4" w:space="0" w:color="000000"/>
+              <w:bottom w:val="single" w:sz="4" w:space="0" w:color="000000"/>
+              <w:right w:val="single" w:sz="4" w:space="0" w:color="000000"/>
+            </w:tcBorders>
+            <w:tcMar>
+              <w:top w:w="0" w:type="dxa"/>
+              <w:left w:w="108" w:type="dxa"/>
+              <w:bottom w:w="0" w:type="dxa"/>
+              <w:right w:w="108" w:type="dxa"/>
+            </w:tcMar>
+            <w:hideMark/>
+          </w:tcPr>
+          <w:p>
+            <w:proofErr w:type="spellStart"/>
+            <w:r>
+              <w:t>Id</w:t>
+            </w:r>
+            <w:proofErr w:type="spellEnd"/>
+          </w:p>
+        </w:tc>
+        <w:tc>
+          <w:tcPr>
+            <w:tcW w:w="1527" w:type="dxa"/>
+            <w:tcBorders>
+              <w:top w:val="single" w:sz="4" w:space="0" w:color="000000"/>
+              <w:left w:val="single" w:sz="4" w:space="0" w:color="000000"/>
+              <w:bottom w:val="single" w:sz="4" w:space="0" w:color="000000"/>
+              <w:right w:val="single" w:sz="4" w:space="0" w:color="000000"/>
+            </w:tcBorders>
+            <w:tcMar>
+              <w:top w:w="0" w:type="dxa"/>
+              <w:left w:w="108" w:type="dxa"/>
+              <w:bottom w:w="0" w:type="dxa"/>
+              <w:right w:w="108" w:type="dxa"/>
+            </w:tcMar>
+            <w:hideMark/>
+          </w:tcPr>
+          <w:p>
+            <w:r>
+              <w:t>INT</w:t>
+            </w:r>
+          </w:p>
+        </w:tc>
+        <w:tc>
+          <w:tcPr>
+            <w:tcW w:w="1136" w:type="dxa"/>
+            <w:tcBorders>
+              <w:top w:val="single" w:sz="4" w:space="0" w:color="000000"/>
+              <w:left w:val="single" w:sz="4" w:space="0" w:color="000000"/>
+              <w:bottom w:val="single" w:sz="4" w:space="0" w:color="000000"/>
+              <w:right w:val="single" w:sz="4" w:space="0" w:color="000000"/>
+            </w:tcBorders>
+            <w:tcMar>
+              <w:top w:w="0" w:type="dxa"/>
+              <w:left w:w="108" w:type="dxa"/>
+              <w:bottom w:w="0" w:type="dxa"/>
+              <w:right w:w="108" w:type="dxa"/>
+            </w:tcMar>
+          </w:tcPr>
+          <w:p/>
+        </w:tc>
+        <w:tc>
+          <w:tcPr>
+            <w:tcW w:w="1247" w:type="dxa"/>
+            <w:tcBorders>
+              <w:top w:val="single" w:sz="4" w:space="0" w:color="000000"/>
+              <w:left w:val="single" w:sz="4" w:space="0" w:color="000000"/>
+              <w:bottom w:val="single" w:sz="4" w:space="0" w:color="000000"/>
+              <w:right w:val="single" w:sz="4" w:space="0" w:color="000000"/>
+            </w:tcBorders>
+            <w:tcMar>
+              <w:top w:w="0" w:type="dxa"/>
+              <w:left w:w="108" w:type="dxa"/>
+              <w:bottom w:w="0" w:type="dxa"/>
+              <w:right w:w="108" w:type="dxa"/>
+            </w:tcMar>
+            <w:hideMark/>
+          </w:tcPr>
+          <w:p>
+            <w:r>
+              <w:t>Nee</w:t>
+            </w:r>
+          </w:p>
+        </w:tc>
+        <w:tc>
+          <w:tcPr>
+            <w:tcW w:w="2128" w:type="dxa"/>
+            <w:tcBorders>
+              <w:top w:val="single" w:sz="4" w:space="0" w:color="000000"/>
+              <w:left w:val="single" w:sz="4" w:space="0" w:color="000000"/>
+              <w:bottom w:val="single" w:sz="4" w:space="0" w:color="000000"/>
+              <w:right w:val="single" w:sz="4" w:space="0" w:color="000000"/>
+            </w:tcBorders>
+            <w:tcMar>
+              <w:top w:w="0" w:type="dxa"/>
+              <w:left w:w="108" w:type="dxa"/>
+              <w:bottom w:w="0" w:type="dxa"/>
+              <w:right w:w="108" w:type="dxa"/>
+            </w:tcMar>
+            <w:hideMark/>
+          </w:tcPr>
+          <w:p>
+            <w:r>
+              <w:t>UNSIGNED, AUTO_INCREMENT</w:t>
+            </w:r>
+          </w:p>
+        </w:tc>
+      </w:tr>
+      <w:tr>
+        <w:tc>
+          <w:tcPr>
+            <w:tcW w:w="3024" w:type="dxa"/>
+            <w:tcBorders>
+              <w:top w:val="single" w:sz="4" w:space="0" w:color="000000"/>
+              <w:left w:val="single" w:sz="4" w:space="0" w:color="000000"/>
+              <w:bottom w:val="single" w:sz="4" w:space="0" w:color="000000"/>
+              <w:right w:val="single" w:sz="4" w:space="0" w:color="000000"/>
+            </w:tcBorders>
+            <w:tcMar>
+              <w:top w:w="0" w:type="dxa"/>
+              <w:left w:w="108" w:type="dxa"/>
+              <w:bottom w:w="0" w:type="dxa"/>
+              <w:right w:w="108" w:type="dxa"/>
+            </w:tcMar>
+            <w:hideMark/>
+          </w:tcPr>
+          <w:p>
+            <w:pPr>
+              <w:rPr>
+                <w:lang w:val="en-NL"/>
+              </w:rPr>
+            </w:pPr>
+            <w:proofErr w:type="spellStart"/>
+            <w:r>
+              <w:rPr>
+                <w:lang w:val="en-NL"/>
+              </w:rPr>
+              <w:t>ProductId</w:t>
+            </w:r>
+            <w:proofErr w:type="spellEnd"/>
+          </w:p>
+        </w:tc>
+        <w:tc>
+          <w:tcPr>
+            <w:tcW w:w="1527" w:type="dxa"/>
+            <w:tcBorders>
+              <w:top w:val="single" w:sz="4" w:space="0" w:color="000000"/>
+              <w:left w:val="single" w:sz="4" w:space="0" w:color="000000"/>
+              <w:bottom w:val="single" w:sz="4" w:space="0" w:color="000000"/>
+              <w:right w:val="single" w:sz="4" w:space="0" w:color="000000"/>
+            </w:tcBorders>
+            <w:tcMar>
+              <w:top w:w="0" w:type="dxa"/>
+              <w:left w:w="108" w:type="dxa"/>
+              <w:bottom w:w="0" w:type="dxa"/>
+              <w:right w:w="108" w:type="dxa"/>
+            </w:tcMar>
+            <w:hideMark/>
+          </w:tcPr>
+          <w:p>
+            <w:r>
+              <w:t>INT</w:t>
+            </w:r>
+          </w:p>
+        </w:tc>
+        <w:tc>
+          <w:tcPr>
+            <w:tcW w:w="1136" w:type="dxa"/>
+            <w:tcBorders>
+              <w:top w:val="single" w:sz="4" w:space="0" w:color="000000"/>
+              <w:left w:val="single" w:sz="4" w:space="0" w:color="000000"/>
+              <w:bottom w:val="single" w:sz="4" w:space="0" w:color="000000"/>
+              <w:right w:val="single" w:sz="4" w:space="0" w:color="000000"/>
+            </w:tcBorders>
+            <w:tcMar>
+              <w:top w:w="0" w:type="dxa"/>
+              <w:left w:w="108" w:type="dxa"/>
+              <w:bottom w:w="0" w:type="dxa"/>
+              <w:right w:w="108" w:type="dxa"/>
+            </w:tcMar>
+            <w:hideMark/>
+          </w:tcPr>
+          <w:p/>
+        </w:tc>
+        <w:tc>
+          <w:tcPr>
+            <w:tcW w:w="1247" w:type="dxa"/>
+            <w:tcBorders>
+              <w:top w:val="single" w:sz="4" w:space="0" w:color="000000"/>
+              <w:left w:val="single" w:sz="4" w:space="0" w:color="000000"/>
+              <w:bottom w:val="single" w:sz="4" w:space="0" w:color="000000"/>
+              <w:right w:val="single" w:sz="4" w:space="0" w:color="000000"/>
+            </w:tcBorders>
+            <w:tcMar>
+              <w:top w:w="0" w:type="dxa"/>
+              <w:left w:w="108" w:type="dxa"/>
+              <w:bottom w:w="0" w:type="dxa"/>
+              <w:right w:w="108" w:type="dxa"/>
+            </w:tcMar>
+            <w:hideMark/>
+          </w:tcPr>
+          <w:p>
+            <w:r>
+              <w:t>nee</w:t>
+            </w:r>
+          </w:p>
+        </w:tc>
+        <w:tc>
+          <w:tcPr>
+            <w:tcW w:w="2128" w:type="dxa"/>
+            <w:tcBorders>
+              <w:top w:val="single" w:sz="4" w:space="0" w:color="000000"/>
+              <w:left w:val="single" w:sz="4" w:space="0" w:color="000000"/>
+              <w:bottom w:val="single" w:sz="4" w:space="0" w:color="000000"/>
+              <w:right w:val="single" w:sz="4" w:space="0" w:color="000000"/>
+            </w:tcBorders>
+            <w:tcMar>
+              <w:top w:w="0" w:type="dxa"/>
+              <w:left w:w="108" w:type="dxa"/>
+              <w:bottom w:w="0" w:type="dxa"/>
+              <w:right w:w="108" w:type="dxa"/>
+            </w:tcMar>
+            <w:hideMark/>
+          </w:tcPr>
+          <w:p>
+            <w:r>
+              <w:t>FOREIGN</w:t>
+            </w:r>
+          </w:p>
+        </w:tc>
+      </w:tr>
+      <w:tr>
+        <w:tc>
+          <w:tcPr>
+            <w:tcW w:w="3024" w:type="dxa"/>
+            <w:tcBorders>
+              <w:top w:val="single" w:sz="4" w:space="0" w:color="000000"/>
+              <w:left w:val="single" w:sz="4" w:space="0" w:color="000000"/>
+              <w:bottom w:val="single" w:sz="4" w:space="0" w:color="000000"/>
+              <w:right w:val="single" w:sz="4" w:space="0" w:color="000000"/>
+            </w:tcBorders>
+            <w:tcMar>
+              <w:top w:w="0" w:type="dxa"/>
+              <w:left w:w="108" w:type="dxa"/>
+              <w:bottom w:w="0" w:type="dxa"/>
+              <w:right w:w="108" w:type="dxa"/>
+            </w:tcMar>
+          </w:tcPr>
+          <w:p>
+            <w:pPr>
+              <w:rPr>
+                <w:lang w:val="en-NL"/>
+              </w:rPr>
+            </w:pPr>
+            <w:proofErr w:type="spellStart"/>
+            <w:r>
+              <w:rPr>
+                <w:lang w:val="en-NL"/>
+              </w:rPr>
+              <w:t>EinddatumLevering</w:t>
+            </w:r>
+            <w:proofErr w:type="spellEnd"/>
+          </w:p>
+        </w:tc>
+        <w:tc>
+          <w:tcPr>
+            <w:tcW w:w="1527" w:type="dxa"/>
+            <w:tcBorders>
+              <w:top w:val="single" w:sz="4" w:space="0" w:color="000000"/>
+              <w:left w:val="single" w:sz="4" w:space="0" w:color="000000"/>
+              <w:bottom w:val="single" w:sz="4" w:space="0" w:color="000000"/>
+              <w:right w:val="single" w:sz="4" w:space="0" w:color="000000"/>
+            </w:tcBorders>
+            <w:tcMar>
+              <w:top w:w="0" w:type="dxa"/>
+              <w:left w:w="108" w:type="dxa"/>
+              <w:bottom w:w="0" w:type="dxa"/>
+              <w:right w:w="108" w:type="dxa"/>
+            </w:tcMar>
+          </w:tcPr>
+          <w:p>
+            <w:pPr>
+              <w:rPr>
+                <w:lang w:val="en-NL"/>
+              </w:rPr>
+            </w:pPr>
+            <w:r>
+              <w:rPr>
+                <w:lang w:val="en-NL"/>
+              </w:rPr>
+              <w:t>DATE</w:t>
+            </w:r>
+          </w:p>
+        </w:tc>
+        <w:tc>
+          <w:tcPr>
+            <w:tcW w:w="1136" w:type="dxa"/>
+            <w:tcBorders>
+              <w:top w:val="single" w:sz="4" w:space="0" w:color="000000"/>
+              <w:left w:val="single" w:sz="4" w:space="0" w:color="000000"/>
+              <w:bottom w:val="single" w:sz="4" w:space="0" w:color="000000"/>
+              <w:right w:val="single" w:sz="4" w:space="0" w:color="000000"/>
+            </w:tcBorders>
+            <w:tcMar>
+              <w:top w:w="0" w:type="dxa"/>
+              <w:left w:w="108" w:type="dxa"/>
+              <w:bottom w:w="0" w:type="dxa"/>
+              <w:right w:w="108" w:type="dxa"/>
+            </w:tcMar>
+          </w:tcPr>
+          <w:p/>
+        </w:tc>
+        <w:tc>
+          <w:tcPr>
+            <w:tcW w:w="1247" w:type="dxa"/>
+            <w:tcBorders>
+              <w:top w:val="single" w:sz="4" w:space="0" w:color="000000"/>
+              <w:left w:val="single" w:sz="4" w:space="0" w:color="000000"/>
+              <w:bottom w:val="single" w:sz="4" w:space="0" w:color="000000"/>
+              <w:right w:val="single" w:sz="4" w:space="0" w:color="000000"/>
+            </w:tcBorders>
+            <w:tcMar>
+              <w:top w:w="0" w:type="dxa"/>
+              <w:left w:w="108" w:type="dxa"/>
+              <w:bottom w:w="0" w:type="dxa"/>
+              <w:right w:w="108" w:type="dxa"/>
+            </w:tcMar>
+          </w:tcPr>
+          <w:p>
+            <w:r>
+              <w:t>nee</w:t>
+            </w:r>
+          </w:p>
+        </w:tc>
+        <w:tc>
+          <w:tcPr>
+            <w:tcW w:w="2128" w:type="dxa"/>
+            <w:tcBorders>
+              <w:top w:val="single" w:sz="4" w:space="0" w:color="000000"/>
+              <w:left w:val="single" w:sz="4" w:space="0" w:color="000000"/>
+              <w:bottom w:val="single" w:sz="4" w:space="0" w:color="000000"/>
+              <w:right w:val="single" w:sz="4" w:space="0" w:color="000000"/>
+            </w:tcBorders>
+            <w:tcMar>
+              <w:top w:w="0" w:type="dxa"/>
+              <w:left w:w="108" w:type="dxa"/>
+              <w:bottom w:w="0" w:type="dxa"/>
+              <w:right w:w="108" w:type="dxa"/>
+            </w:tcMar>
+          </w:tcPr>
+          <w:p/>
+        </w:tc>
+      </w:tr>
+      <w:tr>
+        <w:tc>
+          <w:tcPr>
+            <w:tcW w:w="3024" w:type="dxa"/>
+            <w:tcBorders>
+              <w:top w:val="single" w:sz="4" w:space="0" w:color="000000"/>
+              <w:left w:val="single" w:sz="4" w:space="0" w:color="000000"/>
+              <w:bottom w:val="single" w:sz="4" w:space="0" w:color="000000"/>
+              <w:right w:val="single" w:sz="4" w:space="0" w:color="000000"/>
+            </w:tcBorders>
+            <w:tcMar>
+              <w:top w:w="0" w:type="dxa"/>
+              <w:left w:w="108" w:type="dxa"/>
+              <w:bottom w:w="0" w:type="dxa"/>
+              <w:right w:w="108" w:type="dxa"/>
+            </w:tcMar>
+            <w:hideMark/>
+          </w:tcPr>
+          <w:p>
+            <w:proofErr w:type="spellStart"/>
+            <w:r>
+              <w:t>IsActief</w:t>
+            </w:r>
+            <w:proofErr w:type="spellEnd"/>
+          </w:p>
+        </w:tc>
+        <w:tc>
+          <w:tcPr>
+            <w:tcW w:w="1527" w:type="dxa"/>
+            <w:tcBorders>
+              <w:top w:val="single" w:sz="4" w:space="0" w:color="000000"/>
+              <w:left w:val="single" w:sz="4" w:space="0" w:color="000000"/>
+              <w:bottom w:val="single" w:sz="4" w:space="0" w:color="000000"/>
+              <w:right w:val="single" w:sz="4" w:space="0" w:color="000000"/>
+            </w:tcBorders>
+            <w:tcMar>
+              <w:top w:w="0" w:type="dxa"/>
+              <w:left w:w="108" w:type="dxa"/>
+              <w:bottom w:w="0" w:type="dxa"/>
+              <w:right w:w="108" w:type="dxa"/>
+            </w:tcMar>
+            <w:hideMark/>
+          </w:tcPr>
+          <w:p>
+            <w:r>
+              <w:t>BIT</w:t>
+            </w:r>
+          </w:p>
+        </w:tc>
+        <w:tc>
+          <w:tcPr>
+            <w:tcW w:w="1136" w:type="dxa"/>
+            <w:tcBorders>
+              <w:top w:val="single" w:sz="4" w:space="0" w:color="000000"/>
+              <w:left w:val="single" w:sz="4" w:space="0" w:color="000000"/>
+              <w:bottom w:val="single" w:sz="4" w:space="0" w:color="000000"/>
+              <w:right w:val="single" w:sz="4" w:space="0" w:color="000000"/>
+            </w:tcBorders>
+            <w:tcMar>
+              <w:top w:w="0" w:type="dxa"/>
+              <w:left w:w="108" w:type="dxa"/>
+              <w:bottom w:w="0" w:type="dxa"/>
+              <w:right w:w="108" w:type="dxa"/>
+            </w:tcMar>
+          </w:tcPr>
+          <w:p/>
+        </w:tc>
+        <w:tc>
+          <w:tcPr>
+            <w:tcW w:w="1247" w:type="dxa"/>
+            <w:tcBorders>
+              <w:top w:val="single" w:sz="4" w:space="0" w:color="000000"/>
+              <w:left w:val="single" w:sz="4" w:space="0" w:color="000000"/>
+              <w:bottom w:val="single" w:sz="4" w:space="0" w:color="000000"/>
+              <w:right w:val="single" w:sz="4" w:space="0" w:color="000000"/>
+            </w:tcBorders>
+            <w:tcMar>
+              <w:top w:w="0" w:type="dxa"/>
+              <w:left w:w="108" w:type="dxa"/>
+              <w:bottom w:w="0" w:type="dxa"/>
+              <w:right w:w="108" w:type="dxa"/>
+            </w:tcMar>
+            <w:hideMark/>
+          </w:tcPr>
+          <w:p>
+            <w:r>
+              <w:t>Nee</w:t>
+            </w:r>
+          </w:p>
+        </w:tc>
+        <w:tc>
+          <w:tcPr>
+            <w:tcW w:w="2128" w:type="dxa"/>
+            <w:tcBorders>
+              <w:top w:val="single" w:sz="4" w:space="0" w:color="000000"/>
+              <w:left w:val="single" w:sz="4" w:space="0" w:color="000000"/>
+              <w:bottom w:val="single" w:sz="4" w:space="0" w:color="000000"/>
+              <w:right w:val="single" w:sz="4" w:space="0" w:color="000000"/>
+            </w:tcBorders>
+            <w:tcMar>
+              <w:top w:w="0" w:type="dxa"/>
+              <w:left w:w="108" w:type="dxa"/>
+              <w:bottom w:w="0" w:type="dxa"/>
+              <w:right w:w="108" w:type="dxa"/>
+            </w:tcMar>
+            <w:hideMark/>
+          </w:tcPr>
+          <w:p>
+            <w:r>
+              <w:t xml:space="preserve">DEFAULT 1      </w:t>
+            </w:r>
+          </w:p>
+        </w:tc>
+      </w:tr>
+      <w:tr>
+        <w:tc>
+          <w:tcPr>
+            <w:tcW w:w="3024" w:type="dxa"/>
+            <w:tcBorders>
+              <w:top w:val="single" w:sz="4" w:space="0" w:color="000000"/>
+              <w:left w:val="single" w:sz="4" w:space="0" w:color="000000"/>
+              <w:bottom w:val="single" w:sz="4" w:space="0" w:color="000000"/>
+              <w:right w:val="single" w:sz="4" w:space="0" w:color="000000"/>
+            </w:tcBorders>
+            <w:tcMar>
+              <w:top w:w="0" w:type="dxa"/>
+              <w:left w:w="108" w:type="dxa"/>
+              <w:bottom w:w="0" w:type="dxa"/>
+              <w:right w:w="108" w:type="dxa"/>
+            </w:tcMar>
+            <w:hideMark/>
+          </w:tcPr>
+          <w:p>
+            <w:r>
+              <w:t>Opmerking</w:t>
+            </w:r>
+          </w:p>
+        </w:tc>
+        <w:tc>
+          <w:tcPr>
+            <w:tcW w:w="1527" w:type="dxa"/>
+            <w:tcBorders>
+              <w:top w:val="single" w:sz="4" w:space="0" w:color="000000"/>
+              <w:left w:val="single" w:sz="4" w:space="0" w:color="000000"/>
+              <w:bottom w:val="single" w:sz="4" w:space="0" w:color="000000"/>
+              <w:right w:val="single" w:sz="4" w:space="0" w:color="000000"/>
+            </w:tcBorders>
+            <w:tcMar>
+              <w:top w:w="0" w:type="dxa"/>
+              <w:left w:w="108" w:type="dxa"/>
+              <w:bottom w:w="0" w:type="dxa"/>
+              <w:right w:w="108" w:type="dxa"/>
+            </w:tcMar>
+            <w:hideMark/>
+          </w:tcPr>
+          <w:p>
+            <w:r>
+              <w:t>VARCHAR</w:t>
+            </w:r>
+          </w:p>
+        </w:tc>
+        <w:tc>
+          <w:tcPr>
+            <w:tcW w:w="1136" w:type="dxa"/>
+            <w:tcBorders>
+              <w:top w:val="single" w:sz="4" w:space="0" w:color="000000"/>
+              <w:left w:val="single" w:sz="4" w:space="0" w:color="000000"/>
+              <w:bottom w:val="single" w:sz="4" w:space="0" w:color="000000"/>
+              <w:right w:val="single" w:sz="4" w:space="0" w:color="000000"/>
+            </w:tcBorders>
+            <w:tcMar>
+              <w:top w:w="0" w:type="dxa"/>
+              <w:left w:w="108" w:type="dxa"/>
+              <w:bottom w:w="0" w:type="dxa"/>
+              <w:right w:w="108" w:type="dxa"/>
+            </w:tcMar>
+            <w:hideMark/>
+          </w:tcPr>
+          <w:p>
+            <w:r>
+              <w:t>255</w:t>
+            </w:r>
+          </w:p>
+        </w:tc>
+        <w:tc>
+          <w:tcPr>
+            <w:tcW w:w="1247" w:type="dxa"/>
+            <w:tcBorders>
+              <w:top w:val="single" w:sz="4" w:space="0" w:color="000000"/>
+              <w:left w:val="single" w:sz="4" w:space="0" w:color="000000"/>
+              <w:bottom w:val="single" w:sz="4" w:space="0" w:color="000000"/>
+              <w:right w:val="single" w:sz="4" w:space="0" w:color="000000"/>
+            </w:tcBorders>
+            <w:tcMar>
+              <w:top w:w="0" w:type="dxa"/>
+              <w:left w:w="108" w:type="dxa"/>
+              <w:bottom w:w="0" w:type="dxa"/>
+              <w:right w:w="108" w:type="dxa"/>
+            </w:tcMar>
+            <w:hideMark/>
+          </w:tcPr>
+          <w:p>
+            <w:r>
+              <w:t>Ja</w:t>
+            </w:r>
+          </w:p>
+        </w:tc>
+        <w:tc>
+          <w:tcPr>
+            <w:tcW w:w="2128" w:type="dxa"/>
+            <w:tcBorders>
+              <w:top w:val="single" w:sz="4" w:space="0" w:color="000000"/>
+              <w:left w:val="single" w:sz="4" w:space="0" w:color="000000"/>
+              <w:bottom w:val="single" w:sz="4" w:space="0" w:color="000000"/>
+              <w:right w:val="single" w:sz="4" w:space="0" w:color="000000"/>
+            </w:tcBorders>
+            <w:tcMar>
+              <w:top w:w="0" w:type="dxa"/>
+              <w:left w:w="108" w:type="dxa"/>
+              <w:bottom w:w="0" w:type="dxa"/>
+              <w:right w:w="108" w:type="dxa"/>
+            </w:tcMar>
+            <w:hideMark/>
+          </w:tcPr>
+          <w:p>
+            <w:r>
+              <w:t>DEFAULT NULL</w:t>
+            </w:r>
+          </w:p>
+        </w:tc>
+      </w:tr>
+      <w:tr>
+        <w:tc>
+          <w:tcPr>
+            <w:tcW w:w="3024" w:type="dxa"/>
+            <w:tcBorders>
+              <w:top w:val="single" w:sz="4" w:space="0" w:color="000000"/>
+              <w:left w:val="single" w:sz="4" w:space="0" w:color="000000"/>
+              <w:bottom w:val="single" w:sz="4" w:space="0" w:color="000000"/>
+              <w:right w:val="single" w:sz="4" w:space="0" w:color="000000"/>
+            </w:tcBorders>
+            <w:tcMar>
+              <w:top w:w="0" w:type="dxa"/>
+              <w:left w:w="108" w:type="dxa"/>
+              <w:bottom w:w="0" w:type="dxa"/>
+              <w:right w:w="108" w:type="dxa"/>
+            </w:tcMar>
+            <w:hideMark/>
+          </w:tcPr>
+          <w:p>
+            <w:proofErr w:type="spellStart"/>
+            <w:r>
+              <w:t>DatumAangemaakt</w:t>
+            </w:r>
+            <w:proofErr w:type="spellEnd"/>
+          </w:p>
+        </w:tc>
+        <w:tc>
+          <w:tcPr>
+            <w:tcW w:w="1527" w:type="dxa"/>
+            <w:tcBorders>
+              <w:top w:val="single" w:sz="4" w:space="0" w:color="000000"/>
+              <w:left w:val="single" w:sz="4" w:space="0" w:color="000000"/>
+              <w:bottom w:val="single" w:sz="4" w:space="0" w:color="000000"/>
+              <w:right w:val="single" w:sz="4" w:space="0" w:color="000000"/>
+            </w:tcBorders>
+            <w:tcMar>
+              <w:top w:w="0" w:type="dxa"/>
+              <w:left w:w="108" w:type="dxa"/>
+              <w:bottom w:w="0" w:type="dxa"/>
+              <w:right w:w="108" w:type="dxa"/>
+            </w:tcMar>
+            <w:hideMark/>
+          </w:tcPr>
+          <w:p>
+            <w:r>
+              <w:t>DATETIME(6)</w:t>
+            </w:r>
+          </w:p>
+        </w:tc>
+        <w:tc>
+          <w:tcPr>
+            <w:tcW w:w="1136" w:type="dxa"/>
+            <w:tcBorders>
+              <w:top w:val="single" w:sz="4" w:space="0" w:color="000000"/>
+              <w:left w:val="single" w:sz="4" w:space="0" w:color="000000"/>
+              <w:bottom w:val="single" w:sz="4" w:space="0" w:color="000000"/>
+              <w:right w:val="single" w:sz="4" w:space="0" w:color="000000"/>
+            </w:tcBorders>
+            <w:tcMar>
+              <w:top w:w="0" w:type="dxa"/>
+              <w:left w:w="108" w:type="dxa"/>
+              <w:bottom w:w="0" w:type="dxa"/>
+              <w:right w:w="108" w:type="dxa"/>
+            </w:tcMar>
+            <w:hideMark/>
+          </w:tcPr>
+          <w:p/>
+        </w:tc>
+        <w:tc>
+          <w:tcPr>
+            <w:tcW w:w="1247" w:type="dxa"/>
+            <w:tcBorders>
+              <w:top w:val="single" w:sz="4" w:space="0" w:color="000000"/>
+              <w:left w:val="single" w:sz="4" w:space="0" w:color="000000"/>
+              <w:bottom w:val="single" w:sz="4" w:space="0" w:color="000000"/>
+              <w:right w:val="single" w:sz="4" w:space="0" w:color="000000"/>
+            </w:tcBorders>
+            <w:tcMar>
+              <w:top w:w="0" w:type="dxa"/>
+              <w:left w:w="108" w:type="dxa"/>
+              <w:bottom w:w="0" w:type="dxa"/>
+              <w:right w:w="108" w:type="dxa"/>
+            </w:tcMar>
+            <w:hideMark/>
+          </w:tcPr>
+          <w:p>
+            <w:r>
+              <w:t>Nee</w:t>
+            </w:r>
+          </w:p>
+        </w:tc>
+        <w:tc>
+          <w:tcPr>
+            <w:tcW w:w="2128" w:type="dxa"/>
+            <w:tcBorders>
+              <w:top w:val="single" w:sz="4" w:space="0" w:color="000000"/>
+              <w:left w:val="single" w:sz="4" w:space="0" w:color="000000"/>
+              <w:bottom w:val="single" w:sz="4" w:space="0" w:color="000000"/>
+              <w:right w:val="single" w:sz="4" w:space="0" w:color="000000"/>
+            </w:tcBorders>
+            <w:tcMar>
+              <w:top w:w="0" w:type="dxa"/>
+              <w:left w:w="108" w:type="dxa"/>
+              <w:bottom w:w="0" w:type="dxa"/>
+              <w:right w:w="108" w:type="dxa"/>
+            </w:tcMar>
+            <w:hideMark/>
+          </w:tcPr>
+          <w:p>
+            <w:r>
+              <w:t>DEFAULT NOW(6)</w:t>
+            </w:r>
+          </w:p>
+        </w:tc>
+      </w:tr>
+      <w:tr>
+        <w:tc>
+          <w:tcPr>
+            <w:tcW w:w="3024" w:type="dxa"/>
+            <w:tcBorders>
+              <w:top w:val="single" w:sz="4" w:space="0" w:color="000000"/>
+              <w:left w:val="single" w:sz="4" w:space="0" w:color="000000"/>
+              <w:bottom w:val="single" w:sz="4" w:space="0" w:color="000000"/>
+              <w:right w:val="single" w:sz="4" w:space="0" w:color="000000"/>
+            </w:tcBorders>
+            <w:tcMar>
+              <w:top w:w="0" w:type="dxa"/>
+              <w:left w:w="108" w:type="dxa"/>
+              <w:bottom w:w="0" w:type="dxa"/>
+              <w:right w:w="108" w:type="dxa"/>
+            </w:tcMar>
+            <w:hideMark/>
+          </w:tcPr>
+          <w:p>
+            <w:proofErr w:type="spellStart"/>
+            <w:r>
+              <w:t>DatumGewijzigd</w:t>
+            </w:r>
+            <w:proofErr w:type="spellEnd"/>
+          </w:p>
+        </w:tc>
+        <w:tc>
+          <w:tcPr>
+            <w:tcW w:w="1527" w:type="dxa"/>
+            <w:tcBorders>
+              <w:top w:val="single" w:sz="4" w:space="0" w:color="000000"/>
+              <w:left w:val="single" w:sz="4" w:space="0" w:color="000000"/>
+              <w:bottom w:val="single" w:sz="4" w:space="0" w:color="000000"/>
+              <w:right w:val="single" w:sz="4" w:space="0" w:color="000000"/>
+            </w:tcBorders>
+            <w:tcMar>
+              <w:top w:w="0" w:type="dxa"/>
+              <w:left w:w="108" w:type="dxa"/>
+              <w:bottom w:w="0" w:type="dxa"/>
+              <w:right w:w="108" w:type="dxa"/>
+            </w:tcMar>
+            <w:hideMark/>
+          </w:tcPr>
+          <w:p>
+            <w:r>
+              <w:t>DATETIME(6)</w:t>
+            </w:r>
+          </w:p>
+        </w:tc>
+        <w:tc>
+          <w:tcPr>
+            <w:tcW w:w="1136" w:type="dxa"/>
+            <w:tcBorders>
+              <w:top w:val="single" w:sz="4" w:space="0" w:color="000000"/>
+              <w:left w:val="single" w:sz="4" w:space="0" w:color="000000"/>
+              <w:bottom w:val="single" w:sz="4" w:space="0" w:color="000000"/>
+              <w:right w:val="single" w:sz="4" w:space="0" w:color="000000"/>
+            </w:tcBorders>
+            <w:tcMar>
+              <w:top w:w="0" w:type="dxa"/>
+              <w:left w:w="108" w:type="dxa"/>
+              <w:bottom w:w="0" w:type="dxa"/>
+              <w:right w:w="108" w:type="dxa"/>
+            </w:tcMar>
+            <w:hideMark/>
+          </w:tcPr>
+          <w:p/>
+        </w:tc>
+        <w:tc>
+          <w:tcPr>
+            <w:tcW w:w="1247" w:type="dxa"/>
+            <w:tcBorders>
+              <w:top w:val="single" w:sz="4" w:space="0" w:color="000000"/>
+              <w:left w:val="single" w:sz="4" w:space="0" w:color="000000"/>
+              <w:bottom w:val="single" w:sz="4" w:space="0" w:color="000000"/>
+              <w:right w:val="single" w:sz="4" w:space="0" w:color="000000"/>
+            </w:tcBorders>
+            <w:tcMar>
+              <w:top w:w="0" w:type="dxa"/>
+              <w:left w:w="108" w:type="dxa"/>
+              <w:bottom w:w="0" w:type="dxa"/>
+              <w:right w:w="108" w:type="dxa"/>
+            </w:tcMar>
+            <w:hideMark/>
+          </w:tcPr>
+          <w:p>
+            <w:r>
+              <w:t>Nee</w:t>
+            </w:r>
+          </w:p>
+        </w:tc>
+        <w:tc>
+          <w:tcPr>
+            <w:tcW w:w="2128" w:type="dxa"/>
             <w:tcBorders>
               <w:top w:val="single" w:sz="4" w:space="0" w:color="000000"/>
               <w:left w:val="single" w:sz="4" w:space="0" w:color="000000"/>
@@ -8496,6 +9484,7 @@
   <w:style w:type="character" w:default="1" w:styleId="DefaultParagraphFont">
     <w:name w:val="Default Paragraph Font"/>
     <w:uiPriority w:val="1"/>
+    <w:semiHidden/>
     <w:unhideWhenUsed/>
   </w:style>
   <w:style w:type="table" w:default="1" w:styleId="TableNormal">

</xml_diff>